<commit_message>
Rebase article on Edinburgh Reflection Toolkit sources
Cuts the philosophical sweep (Aristotle, Dewey, Schon, Habermas, Mezirow,
King and Kitchener) down to a short Socratic opening, and rebuilds the
theoretical content on the University of Edinburgh Reflection Toolkit.

Now uses their definition of reflection, the 5R framework (Bain et al.,
2002) as the depth diagnostic in place of Moon's map of learning, their
reflective-habit material for the capability argument, and their page on
authenticity and reflection as performance for the audience and power
problem. Retains Moon via Edinburgh's assessment rubric.

Co-Authored-By: Claude Opus 5 <noreply@anthropic.com>
Claude-Session: https://claude.ai/code/session_01FW1QcPxcpXnfEQRZ39fCxo
</commit_message>
<xml_diff>
--- a/articles/Feasmen_applied_practical_philosophy.docx
+++ b/articles/Feasmen_applied_practical_philosophy.docx
@@ -44,7 +44,7 @@
           <w:rFonts w:ascii="Calibri" w:hAnsi="Calibri"/>
           <w:sz w:val="26"/>
         </w:rPr>
-        <w:t>What Socrates was actually doing</w:t>
+        <w:t>Socrates left a technique, not a syllabus</w:t>
       </w:r>
     </w:p>
     <w:p>
@@ -63,40 +63,12 @@
     </w:p>
     <w:p>
       <w:r>
-        <w:t>What he was defending was how he had spent his days: stopping people in the street, asking them what they meant by courage or justice, and following the answer until it broke. The method that got him executed was a conversational technique. He asked for a definition, tested it against a case the definition could not hold, and waited while the other person worked out that they had been carrying a belief without knowing what it rested on.</w:t>
+        <w:t>What he was defending was how he had spent his days: stopping people in the street, asking them what they meant by courage or justice, and following the answer until it broke. He asked for a definition, tested it against a case the definition could not hold, and waited while the other person worked out they had been carrying a belief without knowing what it rested on.</w:t>
       </w:r>
     </w:p>
     <w:p>
       <w:r>
-        <w:t>I am not arguing that social workers should read more philosophy. Reading Plato will not improve a chronology or make a section 47 enquiry more proportionate. What is worth taking from the tradition is its technical apparatus: what counts as a ground for a belief, how a belief is held, and what has to happen for it to change.</w:t>
-      </w:r>
-    </w:p>
-    <w:p>
-      <w:r>
-        <w:t xml:space="preserve">That apparatus has a long inheritance in our profession, mostly unacknowledged. Aristotle described </w:t>
-      </w:r>
-      <w:r>
-        <w:rPr>
-          <w:i/>
-        </w:rPr>
-        <w:t>phronesis</w:t>
-      </w:r>
-      <w:r>
-        <w:t>, practical wisdom, as deliberating well about what to do in circumstances no rule covers in advance, and argued that it is acquired the way any disposition is acquired, by doing it repeatedly until it becomes settled (</w:t>
-      </w:r>
-      <w:r>
-        <w:rPr>
-          <w:i/>
-        </w:rPr>
-        <w:t>Nicomachean Ethics</w:t>
-      </w:r>
-      <w:r>
-        <w:t>, Books II and VI). Dewey (1933) defined reflective thought as active, persistent and careful consideration of a belief in the light of the grounds that support it. Schön (1983) put professional knowledge in the swampy lowland where the problems are messy and the technically rigorous answers are not available. Mezirow (1991), drawing on Habermas (1972), asked practitioners to reflect on the premises of a problem rather than on their handling of it.</w:t>
-      </w:r>
-    </w:p>
-    <w:p>
-      <w:r>
-        <w:t>Four traditions, one shape. Each treats reflection as a disposition built by repetition, working on beliefs and the grounds they rest on, rather than as an activity you complete.</w:t>
+        <w:t>I am not arguing that social workers should read more philosophy. Reading Plato will not improve a chronology or make a section 47 enquiry more proportionate. The inheritance worth having is the technique, and the technical understanding of how a belief is held and what makes it change. That inheritance has been worked into teachable form by educationalists, and there is a substantial body of it we largely ignore.</w:t>
       </w:r>
     </w:p>
     <w:p>
@@ -109,32 +81,27 @@
           <w:rFonts w:ascii="Calibri" w:hAnsi="Calibri"/>
           <w:sz w:val="26"/>
         </w:rPr>
-        <w:t>The technicality that decides everything</w:t>
+        <w:t>What the education literature already settled</w:t>
       </w:r>
     </w:p>
     <w:p>
       <w:r>
-        <w:t>How deeply a practitioner can reflect is limited by what they take knowledge to be. This is the piece we leave out, and it is the piece that does the work.</w:t>
+        <w:t>The University of Edinburgh's Reflection Toolkit is the most usable synthesis of that literature I have found, and it is free. It defines reflection as the conscious examination of past experiences, thoughts and ways of doing things, in order to surface learning and bring meaning to the present and the future, and it says that reflection challenges the status quo of practice, thoughts and assumptions (University of Edinburgh, no date a).</w:t>
       </w:r>
     </w:p>
     <w:p>
       <w:r>
-        <w:t>King and Kitchener (1994) mapped this as reflective judgement, moving through three broad levels. Their participants were North American students and adults, so the stages travel to English social work as a developmental pattern rather than as a measure. The pattern is recognisable in supervision.</w:t>
+        <w:t>That last clause is where the work is. Reflection that records what you did is administration. Reflection that tests what you assumed is the capability the PCF asks for, and the two produce documents that look similar.</w:t>
       </w:r>
     </w:p>
     <w:p>
       <w:r>
-        <w:t>A practitioner holding knowledge as certain and possessed by authority looks for the right answer. Reflection becomes checking their practice against procedure, and their honest question is what they should have done. A practitioner holding all evidence as uncertain treats every account as equally weighted. That reads as open-mindedness and works as an inability to decide. In a strategy discussion it produces a worker who can list every family member's perspective and cannot say what they think is happening. A practitioner who can make a judgement, state what it rests on, and give it up when the evidence moves is doing something the first two cannot.</w:t>
+        <w:t>Systemic practice already has the working stance. A hypothesis is a belief you have agreed in advance to give up, and Mason (1993) described the position to practise from as safe uncertainty, holding a view firmly enough to act on while remaining genuinely open to being wrong. That is a competence rather than a personality trait, and it can be taught directly.</w:t>
       </w:r>
     </w:p>
     <w:p>
       <w:r>
-        <w:t>Systemic practice has a name for the third position. A hypothesis is a belief you have agreed in advance to give up, and Mason (1993) described the working stance as safe uncertainty, holding a position firmly enough to act on while remaining genuinely open to being wrong. That is an epistemological competence rather than a personality trait, and it can be taught directly.</w:t>
-      </w:r>
-    </w:p>
-    <w:p>
-      <w:r>
-        <w:t>Moon (2004) makes the same connection: the depth of a person's reflection is limited by their epistemological development, so telling someone to reflect more deeply is useless unless something changes in how they hold what they know.</w:t>
+        <w:t>The Edinburgh toolkit's own theoretical base is the same lineage social work cites and rarely uses: Dewey, Schön, Boud, Keogh and Walker, Moon and Mezirow (University of Edinburgh, no date b). Their assessment rubric is built on Moon, Schön, Boud and Mezirow, and they report that it has established high inter-rater reliability. Two practice educators in my own research asked the profession for a definition of what they were assessing and tools to develop it, and were told it was in the training. It was not. Something close to it has existed in higher education for years.</w:t>
       </w:r>
     </w:p>
     <w:p>
@@ -147,12 +114,12 @@
           <w:rFonts w:ascii="Calibri" w:hAnsi="Calibri"/>
           <w:sz w:val="26"/>
         </w:rPr>
-        <w:t>Moon as a diagnostic and a training plan</w:t>
+        <w:t>The 5R framework: where you are, and what to do next</w:t>
       </w:r>
     </w:p>
     <w:p>
       <w:r>
-        <w:t>Moon's map of learning gives five positions: noticing, making sense, making meaning, working with meaning, and transformative learning (Moon, 2004). Her exercise is to take a single event and write it several times, each account going further than the last, so the writer sees the difference between depths in their own words rather than in a definition. Used this way it tells a practitioner where they currently are and what the next repetition is.</w:t>
+        <w:t>The toolkit sets out several models, including Gibbs' cycle, Driscoll's What? So what? Now what?, the Integrated Reflective Cycle (Bassot, 2013), and the 5R framework (Bain et al., 2002). Most of them are cycles for working through one event. The 5R framework does something more useful for teaching, because its five stages are a scale of depth. It tells a person where their reflection currently stops.</w:t>
       </w:r>
     </w:p>
     <w:p>
@@ -160,10 +127,10 @@
         <w:rPr>
           <w:b/>
         </w:rPr>
-        <w:t>Noticing.</w:t>
+        <w:t>Reporting.</w:t>
       </w:r>
       <w:r>
-        <w:t xml:space="preserve"> The account records what happened. It is accurate, sequenced and flat. The next repetition is to add the writer to it, including what they felt at the time and what they did with that.</w:t>
+        <w:t xml:space="preserve"> A factual account of what happened, who was there and what the circumstances were, with no interpretation. Accurate and flat.</w:t>
       </w:r>
     </w:p>
     <w:p>
@@ -171,10 +138,10 @@
         <w:rPr>
           <w:b/>
         </w:rPr>
-        <w:t>Making sense.</w:t>
+        <w:t>Responding.</w:t>
       </w:r>
       <w:r>
-        <w:t xml:space="preserve"> The account explains events and gives reasons, all of them consistent with each other and none of them questioned. The next repetition is to write the paragraph the account is avoiding, and to say what else the same facts could mean.</w:t>
+        <w:t xml:space="preserve"> What the writer felt and how they reacted. Still descriptive.</w:t>
       </w:r>
     </w:p>
     <w:p>
@@ -182,10 +149,10 @@
         <w:rPr>
           <w:b/>
         </w:rPr>
-        <w:t>Making meaning.</w:t>
+        <w:t>Relating.</w:t>
       </w:r>
       <w:r>
-        <w:t xml:space="preserve"> The account asks what the event meant to the people in it, including the writer, and starts to notice its own standpoint. The next repetition is to set that account beside somebody else's and let it be changed: the family's account, a colleague's, the account of the person who disagreed with you.</w:t>
+        <w:t xml:space="preserve"> The writer connects the event to something else: previous experience, their own skills, a pattern they have seen before. This is where depth starts.</w:t>
       </w:r>
     </w:p>
     <w:p>
@@ -193,10 +160,10 @@
         <w:rPr>
           <w:b/>
         </w:rPr>
-        <w:t>Working with meaning.</w:t>
+        <w:t>Reasoning.</w:t>
       </w:r>
       <w:r>
-        <w:t xml:space="preserve"> The account moves between frames, treats its own interpretation as one reading among several, and can say what would have to be true for it to be wrong. The next repetition is to work backwards from a decision to the assumptions underneath it and test those.</w:t>
+        <w:t xml:space="preserve"> The writer explains why it happened as it did, brings in theory or another perspective, and treats their own reading as one account among others.</w:t>
       </w:r>
     </w:p>
     <w:p>
@@ -204,15 +171,20 @@
         <w:rPr>
           <w:b/>
         </w:rPr>
-        <w:t>Transformative learning.</w:t>
+        <w:t>Reconstructing.</w:t>
       </w:r>
       <w:r>
-        <w:t xml:space="preserve"> The frame itself has moved. The practitioner now sees the case, and often a set of previous cases, differently.</w:t>
+        <w:t xml:space="preserve"> The writer draws a conclusion they can act on and changes how they will practise next time, with reasons.</w:t>
       </w:r>
     </w:p>
     <w:p>
       <w:r>
-        <w:t>The value for a supervisor is that this is diagnosable from a piece of writing or ten minutes of conversation. You are not asking whether someone is reflective. You are asking which of these five their account is doing, and setting the next repetition accordingly. That is a teaching plan, not a judgement.</w:t>
+        <w:t>Almost every weak reflective log I have read stops at Responding. The student describes the visit and says they found it difficult, and that is offered as reflection because feelings are present.</w:t>
+      </w:r>
+    </w:p>
+    <w:p>
+      <w:r>
+        <w:t>The value of naming the stage is that it converts an instruction nobody can act on into one they can. 'Reflect more deeply' is useless. 'Your account stops at Responding, so the next move is Relating: what else does this remind you of, and what pattern is it part of?' is a task with an answer. A supervisor can diagnose this from ten minutes of conversation, and the diagnosis names the next repetition rather than delivering a verdict.</w:t>
       </w:r>
     </w:p>
     <w:p>
@@ -225,27 +197,37 @@
           <w:rFonts w:ascii="Calibri" w:hAnsi="Calibri"/>
           <w:sz w:val="26"/>
         </w:rPr>
-        <w:t>Training the capability</w:t>
+        <w:t>Treating it as a muscle</w:t>
       </w:r>
     </w:p>
     <w:p>
       <w:r>
-        <w:t>Ericsson et al. (1993) found that expert performance is built by deliberate practice: a task pitched at the edge of current ability, immediate feedback, and repetition with the difficulty increased. Their participants were musicians and athletes, so the transfer to professional judgement is an argument rather than a finding. It still sets a useful test. If a practitioner's reflective work sits inside what they can already do, and nobody responds to it, it is developing nothing.</w:t>
+        <w:t>Edinburgh are explicit that a single reflection is worth little. The value comes from repeating the process across a series of experiences until it becomes a habit and a mindset (University of Edinburgh, no date c). The models are circular by design: what you learn from one experience feeds into the next.</w:t>
       </w:r>
     </w:p>
     <w:p>
       <w:r>
-        <w:t>Two cautions come from my own research with practice educators. The first is that reflection grows under discomfort and stops under anxiety. Participants located learning in being uncomfortable, and also described students who became anxious enough that they preferred silence to being wrong. Load builds the capability; too much load stops it.</w:t>
+        <w:t>That is a training principle, and it means reflective capability is built the way any capability is built, by repetition at a level slightly beyond what the person can already do, with feedback. It also means it decays. A practitioner who reflected well as a student and has since written nothing but assessments is not still carrying the capability because they once demonstrated it.</w:t>
       </w:r>
     </w:p>
     <w:p>
       <w:r>
-        <w:t>The second caution is about power, and it is the harder one. One participant observed that power decreases feelings of uncomfortableness. The person setting the load feels less of it than the person carrying it. A supervisor can leave a session judging it productively challenging while the supervisee leaves it frightened, and the supervisor is the one who decides which of those it was.</w:t>
+        <w:t>Two cautions come from my own research with practice educators. Reflection grows under discomfort and stops under anxiety. Participants located learning in being uncomfortable, and also described students who became anxious enough that they preferred silence to being wrong. Load builds the capability, and too much load stops it.</w:t>
       </w:r>
     </w:p>
     <w:p>
       <w:r>
-        <w:t>This is where reflective practice meets a person's relationship to help (Reder and Fredman, 1996). Asking a worker to reflect out loud is asking them to receive help, in front of somebody who may be writing their assessment. Practice educators in my study said, repeatedly, that they recognised self-awareness most reliably by its absence, because absence is easier to evidence than presence. A profession that mainly detects the failure to reflect teaches its members that reflecting out loud is dangerous, and then wonders why the logs read like forms.</w:t>
+        <w:t>The second caution is about power. One participant observed that power decreases feelings of uncomfortableness. The person setting the load feels less of it than the person carrying it, and the supervisor who decides whether a session was productively challenging is the one who felt least of it.</w:t>
+      </w:r>
+    </w:p>
+    <w:p>
+      <w:r>
+        <w:t>Edinburgh reach the same problem from the other direction. When we ask someone to produce a reflection, we create an audience for it, and that has consequences for how authentic mandatory and assessed reflection can be. They are direct that we cannot know whether a reflector is being authentic, and that a person can still reflect honestly within a framework without disclosing more than they want to (University of Edinburgh, no date d).</w:t>
+      </w:r>
+    </w:p>
+    <w:p>
+      <w:r>
+        <w:t>For social work this is the whole difficulty in one sentence. Asking a worker to reflect out loud is asking them to receive help from somebody who may be writing their assessment. Practice educators in my study said they recognised self-awareness most reliably by its absence, because absence is easier to evidence than presence. A profession that mainly detects the failure to reflect teaches its members that reflecting out loud is dangerous, and then wonders why the logs read like forms.</w:t>
       </w:r>
     </w:p>
     <w:p>
@@ -266,7 +248,7 @@
         <w:pStyle w:val="ListBullet"/>
       </w:pPr>
       <w:r>
-        <w:t>Diagnose before you prescribe. Read the next reflective account you are given and locate it on Moon's five, then name the single next repetition rather than asking for more depth in general.</w:t>
+        <w:t>Diagnose before you prescribe. Locate the next reflective account you read on the 5R stages, then name the single next move rather than asking for more depth in general.</w:t>
       </w:r>
     </w:p>
     <w:p>
@@ -274,7 +256,7 @@
         <w:pStyle w:val="ListBullet"/>
       </w:pPr>
       <w:r>
-        <w:t>Teach the epistemological move explicitly. Ask what this rests on, what would change your mind, and what else these facts could mean. Ask it about your own judgements first.</w:t>
+        <w:t>Set the assumption-testing task explicitly. What does this rest on, what would change your mind, and what else could these facts mean. Ask it about your own judgements first.</w:t>
       </w:r>
     </w:p>
     <w:p>
@@ -282,7 +264,7 @@
         <w:pStyle w:val="ListBullet"/>
       </w:pPr>
       <w:r>
-        <w:t>Separate the training session from the assessment. Name out loud which one the conversation is, because the person opposite you cannot always tell.</w:t>
+        <w:t>Separate the training conversation from the assessment. Say out loud which one this is, because the person opposite you cannot always tell.</w:t>
       </w:r>
     </w:p>
     <w:p>
@@ -290,7 +272,15 @@
         <w:pStyle w:val="ListBullet"/>
       </w:pPr>
       <w:r>
-        <w:t>Model being stuck. Say what you do not know while the other person is watching. Reflection is not performed alone in front of a template; it was always a conversation between people who disagreed.</w:t>
+        <w:t>Use a published rubric rather than your own instinct, and give it to the person before they write, not after.</w:t>
+      </w:r>
+    </w:p>
+    <w:p>
+      <w:pPr>
+        <w:pStyle w:val="ListBullet"/>
+      </w:pPr>
+      <w:r>
+        <w:t>Reflect on a series, not an incident. Ask what the last four visits have in common, which is a question a single-event cycle cannot reach.</w:t>
       </w:r>
     </w:p>
     <w:p>
@@ -313,6 +303,34 @@
     </w:p>
     <w:p>
       <w:r>
+        <w:t xml:space="preserve">Bain, J.D., Ballantyne, R., Mills, C. and Packer, J. (2002) </w:t>
+      </w:r>
+      <w:r>
+        <w:rPr>
+          <w:i/>
+        </w:rPr>
+        <w:t>Reflecting on Practice: Student Teachers' Perspectives</w:t>
+      </w:r>
+      <w:r>
+        <w:t>. Flaxton, Qld: Post Pressed.</w:t>
+      </w:r>
+    </w:p>
+    <w:p>
+      <w:r>
+        <w:t xml:space="preserve">Bassot, B. (2013) </w:t>
+      </w:r>
+      <w:r>
+        <w:rPr>
+          <w:i/>
+        </w:rPr>
+        <w:t>The Reflective Journal</w:t>
+      </w:r>
+      <w:r>
+        <w:t>. Basingstoke: Palgrave Macmillan.</w:t>
+      </w:r>
+    </w:p>
+    <w:p>
+      <w:r>
         <w:t xml:space="preserve">BASW (2018) </w:t>
       </w:r>
       <w:r>
@@ -323,62 +341,6 @@
       </w:r>
       <w:r>
         <w:t>. Birmingham: British Association of Social Workers.</w:t>
-      </w:r>
-    </w:p>
-    <w:p>
-      <w:r>
-        <w:t xml:space="preserve">Dewey, J. (1933) </w:t>
-      </w:r>
-      <w:r>
-        <w:rPr>
-          <w:i/>
-        </w:rPr>
-        <w:t>How We Think: A Restatement of the Relation of Reflective Thinking to the Educative Process</w:t>
-      </w:r>
-      <w:r>
-        <w:t>. Boston: D.C. Heath.</w:t>
-      </w:r>
-    </w:p>
-    <w:p>
-      <w:r>
-        <w:t xml:space="preserve">Ericsson, K.A., Krampe, R.T. and Tesch-Römer, C. (1993) 'The role of deliberate practice in the acquisition of expert performance', </w:t>
-      </w:r>
-      <w:r>
-        <w:rPr>
-          <w:i/>
-        </w:rPr>
-        <w:t>Psychological Review</w:t>
-      </w:r>
-      <w:r>
-        <w:t>, 100, 3, pp. 363-406.</w:t>
-      </w:r>
-    </w:p>
-    <w:p>
-      <w:r>
-        <w:t xml:space="preserve">Habermas, J. (1972) </w:t>
-      </w:r>
-      <w:r>
-        <w:rPr>
-          <w:i/>
-        </w:rPr>
-        <w:t>Knowledge and Human Interests</w:t>
-      </w:r>
-      <w:r>
-        <w:t>. London: Heinemann.</w:t>
-      </w:r>
-    </w:p>
-    <w:p>
-      <w:r>
-        <w:t xml:space="preserve">King, P.M. and Kitchener, K.S. (1994) </w:t>
-      </w:r>
-      <w:r>
-        <w:rPr>
-          <w:i/>
-        </w:rPr>
-        <w:t>Developing Reflective Judgment</w:t>
-      </w:r>
-      <w:r>
-        <w:t>. San Francisco: Jossey-Bass.</w:t>
       </w:r>
     </w:p>
     <w:p>
@@ -397,21 +359,7 @@
     </w:p>
     <w:p>
       <w:r>
-        <w:t xml:space="preserve">Mezirow, J. (1991) </w:t>
-      </w:r>
-      <w:r>
-        <w:rPr>
-          <w:i/>
-        </w:rPr>
-        <w:t>Transformative Dimensions of Adult Learning</w:t>
-      </w:r>
-      <w:r>
-        <w:t>. San Francisco: Jossey-Bass.</w:t>
-      </w:r>
-    </w:p>
-    <w:p>
-      <w:r>
-        <w:t xml:space="preserve">Moon, J. (2004) </w:t>
+        <w:t xml:space="preserve">Moon, J.A. (2004) </w:t>
       </w:r>
       <w:r>
         <w:rPr>
@@ -425,30 +373,72 @@
     </w:p>
     <w:p>
       <w:r>
-        <w:t xml:space="preserve">Reder, P. and Fredman, G. (1996) 'The relationship to help: interacting beliefs about the treatment process', </w:t>
+        <w:t xml:space="preserve">University of Edinburgh (no date a) </w:t>
       </w:r>
       <w:r>
         <w:rPr>
           <w:i/>
         </w:rPr>
-        <w:t>Clinical Child Psychology and Psychiatry</w:t>
+        <w:t>Reflection Toolkit</w:t>
       </w:r>
       <w:r>
-        <w:t>, 1, 3, pp. 457-467.</w:t>
+        <w:t>. Available at: https://reflection.ed.ac.uk/ (Accessed: [DATE]).</w:t>
       </w:r>
     </w:p>
     <w:p>
       <w:r>
-        <w:t xml:space="preserve">Schön, D.A. (1983) </w:t>
+        <w:t xml:space="preserve">University of Edinburgh (no date b) </w:t>
       </w:r>
       <w:r>
         <w:rPr>
           <w:i/>
         </w:rPr>
-        <w:t>The Reflective Practitioner: How Professionals Think in Action</w:t>
+        <w:t>Reflection literature</w:t>
       </w:r>
       <w:r>
-        <w:t>. New York: Basic Books.</w:t>
+        <w:t>. Available at: https://reflection.ed.ac.uk/literature (Accessed: [DATE]).</w:t>
+      </w:r>
+    </w:p>
+    <w:p>
+      <w:r>
+        <w:t xml:space="preserve">University of Edinburgh (no date c) </w:t>
+      </w:r>
+      <w:r>
+        <w:rPr>
+          <w:i/>
+        </w:rPr>
+        <w:t>Goals, objectives and reflective habits</w:t>
+      </w:r>
+      <w:r>
+        <w:t>. Available at: https://reflection.ed.ac.uk/reflectors-toolkit/goals-objectives-habits (Accessed: [DATE]).</w:t>
+      </w:r>
+    </w:p>
+    <w:p>
+      <w:r>
+        <w:t xml:space="preserve">University of Edinburgh (no date d) </w:t>
+      </w:r>
+      <w:r>
+        <w:rPr>
+          <w:i/>
+        </w:rPr>
+        <w:t>Authenticity and reflection as performance: reflection with an audience</w:t>
+      </w:r>
+      <w:r>
+        <w:t>. Available at: https://reflection.ed.ac.uk/facilitators-toolkit/where-to-start/authenticity-audience (Accessed: [DATE]).</w:t>
+      </w:r>
+    </w:p>
+    <w:p>
+      <w:r>
+        <w:t xml:space="preserve">University of Edinburgh (no date e) </w:t>
+      </w:r>
+      <w:r>
+        <w:rPr>
+          <w:i/>
+        </w:rPr>
+        <w:t>The 5R framework for reflection</w:t>
+      </w:r>
+      <w:r>
+        <w:t>. Available at: https://reflection.ed.ac.uk/reflectors-toolkit/reflecting-on-experience/5r-framework (Accessed: [DATE]).</w:t>
       </w:r>
     </w:p>
     <w:sectPr>

</xml_diff>

<commit_message>
Refocus article on self-assessment and challenging your own beliefs
The models are now framed as the part already taught, with the 5R stages
kept but compressed. The argument moves to the gap: practitioners are
taught a model and never shown how to judge the quality of their own
reflection or plan its development.

Adds Moon's method of reading your own writing against accounts of the
same event at increasing depth, and her point that depth is limited by how
a person holds knowledge rather than by effort. Turns Edinburgh's
assessment rubric around as a self-assessment instrument.

New section on the techniques that actually develop the capability:
espoused theory against theory-in-use, single- and double-loop learning
(Argyris and Schon), Brookfield's four lenses, and recording the
falsifying condition in advance.

Co-Authored-By: Claude Opus 5 <noreply@anthropic.com>
Claude-Session: https://claude.ai/code/session_01FW1QcPxcpXnfEQRZ39fCxo
</commit_message>
<xml_diff>
--- a/articles/Feasmen_applied_practical_philosophy.docx
+++ b/articles/Feasmen_applied_practical_philosophy.docx
@@ -31,7 +31,7 @@
     </w:p>
     <w:p>
       <w:r>
-        <w:t>The distinction matters more than it sounds. A competence question asks whether a worker can perform the task. A capability question asks whether they will keep learning once nobody is checking. Domain 6 of the Professional Capabilities Framework says that reflection 'enables us to challenge ourselves and others, and maintain our professional curiosity, creativity and self-awareness' (British Association of Social Workers (BASW), 2018, p. 8). It does not say how a person gets better at it, or how anyone would know they had.</w:t>
+        <w:t>A competence question asks whether a worker can perform the task. A capability question asks whether they will keep learning once nobody is checking. Domain 6 of the Professional Capabilities Framework says that reflection 'enables us to challenge ourselves and others, and maintain our professional curiosity, creativity and self-awareness' (British Association of Social Workers (BASW), 2018, p. 8). It does not say how a person gets better at it, or how anyone would know they had.</w:t>
       </w:r>
     </w:p>
     <w:p>
@@ -63,12 +63,12 @@
     </w:p>
     <w:p>
       <w:r>
-        <w:t>What he was defending was how he had spent his days: stopping people in the street, asking them what they meant by courage or justice, and following the answer until it broke. He asked for a definition, tested it against a case the definition could not hold, and waited while the other person worked out they had been carrying a belief without knowing what it rested on.</w:t>
+        <w:t>What he was defending was how he had spent his days: asking people what they meant by courage or justice, then testing the answer against a case it could not hold, and waiting while the other person worked out they had been carrying a belief without knowing what it rested on.</w:t>
       </w:r>
     </w:p>
     <w:p>
       <w:r>
-        <w:t>I am not arguing that social workers should read more philosophy. Reading Plato will not improve a chronology or make a section 47 enquiry more proportionate. The inheritance worth having is the technique, and the technical understanding of how a belief is held and what makes it change. That inheritance has been worked into teachable form by educationalists, and there is a substantial body of it we largely ignore.</w:t>
+        <w:t>I am not arguing that social workers should read more philosophy. Reading Plato will not improve a chronology. The inheritance worth having is the technique, and the technical understanding of how a belief is held and what makes it change. Educationalists have worked that into teachable form, and we largely ignore it.</w:t>
       </w:r>
     </w:p>
     <w:p>
@@ -81,27 +81,27 @@
           <w:rFonts w:ascii="Calibri" w:hAnsi="Calibri"/>
           <w:sz w:val="26"/>
         </w:rPr>
-        <w:t>What the education literature already settled</w:t>
+        <w:t>The models are the part we already teach</w:t>
       </w:r>
     </w:p>
     <w:p>
       <w:r>
-        <w:t>The University of Edinburgh's Reflection Toolkit is the most usable synthesis of that literature I have found, and it is free. It defines reflection as the conscious examination of past experiences, thoughts and ways of doing things, in order to surface learning and bring meaning to the present and the future, and it says that reflection challenges the status quo of practice, thoughts and assumptions (University of Edinburgh, no date a).</w:t>
+        <w:t>The University of Edinburgh's Reflection Toolkit is the most usable synthesis of that work I have found, and it is free. It defines reflection as the conscious examination of experience in order to surface learning and bring meaning to the present and the future, and says that reflection challenges the status quo of practice, thoughts and assumptions (University of Edinburgh, no date a).</w:t>
       </w:r>
     </w:p>
     <w:p>
       <w:r>
-        <w:t>That last clause is where the work is. Reflection that records what you did is administration. Reflection that tests what you assumed is the capability the PCF asks for, and the two produce documents that look similar.</w:t>
+        <w:t>The toolkit sets out the models: Gibbs' cycle, Driscoll's What? So what? Now what?, the Integrated Reflective Cycle (Bassot, 2013), and the 5R framework (Bain et al., 2002). The 5R framework is the most useful for teaching, because its stages are a scale of depth rather than a circuit. Reporting is the factual account. Responding is what you felt. Relating connects the event to previous experience and to patterns. Reasoning explains why it happened that way and brings in other perspectives. Reconstructing changes what you will do, with reasons.</w:t>
       </w:r>
     </w:p>
     <w:p>
       <w:r>
-        <w:t>Systemic practice already has the working stance. A hypothesis is a belief you have agreed in advance to give up, and Mason (1993) described the position to practise from as safe uncertainty, holding a view firmly enough to act on while remaining genuinely open to being wrong. That is a competence rather than a personality trait, and it can be taught directly.</w:t>
+        <w:t>Almost every weak reflective log stops at Responding. The student describes the visit, says they found it difficult, and offers that as reflection because feelings are present.</w:t>
       </w:r>
     </w:p>
     <w:p>
       <w:r>
-        <w:t>The Edinburgh toolkit's own theoretical base is the same lineage social work cites and rarely uses: Dewey, Schön, Boud, Keogh and Walker, Moon and Mezirow (University of Edinburgh, no date b). Their assessment rubric is built on Moon, Schön, Boud and Mezirow, and they report that it has established high inter-rater reliability. Two practice educators in my own research asked the profession for a definition of what they were assessing and tools to develop it, and were told it was in the training. It was not. Something close to it has existed in higher education for years.</w:t>
+        <w:t>This much is taught. Every social worker in England has sat through a session on a model of reflection, and most can name one.</w:t>
       </w:r>
     </w:p>
     <w:p>
@@ -114,77 +114,32 @@
           <w:rFonts w:ascii="Calibri" w:hAnsi="Calibri"/>
           <w:sz w:val="26"/>
         </w:rPr>
-        <w:t>The 5R framework: where you are, and what to do next</w:t>
+        <w:t>Nobody teaches you to mark your own work</w:t>
       </w:r>
     </w:p>
     <w:p>
       <w:r>
-        <w:t>The toolkit sets out several models, including Gibbs' cycle, Driscoll's What? So what? Now what?, the Integrated Reflective Cycle (Bassot, 2013), and the 5R framework (Bain et al., 2002). Most of them are cycles for working through one event. The 5R framework does something more useful for teaching, because its five stages are a scale of depth. It tells a person where their reflection currently stops.</w:t>
+        <w:t>Here is what is missing. A practitioner is taught a model and then left to use it for thirty years without ever being shown how to judge whether their own reflection is any good, or what to do about it if it is not.</w:t>
       </w:r>
     </w:p>
     <w:p>
       <w:r>
-        <w:rPr>
-          <w:b/>
-        </w:rPr>
-        <w:t>Reporting.</w:t>
-      </w:r>
-      <w:r>
-        <w:t xml:space="preserve"> A factual account of what happened, who was there and what the circumstances were, with no interpretation. Accurate and flat.</w:t>
+        <w:t>You cannot improve at something you cannot grade in yourself. Supervision is meant to supply that judgement and often does not, being dominated by case management, and where reflection is assessed it is assessed by somebody with power over you, which changes what you write. The capability has to become self-assessable, or it stays dependent on whoever happens to be supervising you this year.</w:t>
       </w:r>
     </w:p>
     <w:p>
       <w:r>
-        <w:rPr>
-          <w:b/>
-        </w:rPr>
-        <w:t>Responding.</w:t>
-      </w:r>
-      <w:r>
-        <w:t xml:space="preserve"> What the writer felt and how they reacted. Still descriptive.</w:t>
+        <w:t>Moon (2004; 2006) provides the method. Rather than defining depth, she gives accounts of the same event written several times over, each one going further than the last, and invites you to read your own writing against them. It is an unusually honest exercise. You recognise your own reflective log in the second account, the one that explains everything and questions nothing, and no supervisor had to tell you.</w:t>
       </w:r>
     </w:p>
     <w:p>
       <w:r>
-        <w:rPr>
-          <w:b/>
-        </w:rPr>
-        <w:t>Relating.</w:t>
-      </w:r>
-      <w:r>
-        <w:t xml:space="preserve"> The writer connects the event to something else: previous experience, their own skills, a pattern they have seen before. This is where depth starts.</w:t>
+        <w:t>Moon also explains why writing more does not help. The depth a person can reach is limited by how they hold knowledge. A practitioner who treats knowledge as certain and held by authority uses reflection to check themselves against procedure, and their honest question is what they should have done. A practitioner who treats all accounts as equally valid can list every family member's perspective and cannot say what they think is happening. Neither writes deeply, however long the log is, because the limit is not effort.</w:t>
       </w:r>
     </w:p>
     <w:p>
       <w:r>
-        <w:rPr>
-          <w:b/>
-        </w:rPr>
-        <w:t>Reasoning.</w:t>
-      </w:r>
-      <w:r>
-        <w:t xml:space="preserve"> The writer explains why it happened as it did, brings in theory or another perspective, and treats their own reading as one account among others.</w:t>
-      </w:r>
-    </w:p>
-    <w:p>
-      <w:r>
-        <w:rPr>
-          <w:b/>
-        </w:rPr>
-        <w:t>Reconstructing.</w:t>
-      </w:r>
-      <w:r>
-        <w:t xml:space="preserve"> The writer draws a conclusion they can act on and changes how they will practise next time, with reasons.</w:t>
-      </w:r>
-    </w:p>
-    <w:p>
-      <w:r>
-        <w:t>Almost every weak reflective log I have read stops at Responding. The student describes the visit and says they found it difficult, and that is offered as reflection because feelings are present.</w:t>
-      </w:r>
-    </w:p>
-    <w:p>
-      <w:r>
-        <w:t>The value of naming the stage is that it converts an instruction nobody can act on into one they can. 'Reflect more deeply' is useless. 'Your account stops at Responding, so the next move is Relating: what else does this remind you of, and what pattern is it part of?' is a task with an answer. A supervisor can diagnose this from ten minutes of conversation, and the diagnosis names the next repetition rather than delivering a verdict.</w:t>
+        <w:t>Edinburgh's assessment rubric is the second instrument, and there is no reason it should only be used on students. It scales from non-reflective through to critical reflection, with a second axis at the top distinguishing the kind of learning produced, and the toolkit notes that understanding why your practice works counts as much as generating new practice (University of Edinburgh, no date b). Mark your own last three supervision records against it before anybody else does.</w:t>
       </w:r>
     </w:p>
     <w:p>
@@ -197,37 +152,65 @@
           <w:rFonts w:ascii="Calibri" w:hAnsi="Calibri"/>
           <w:sz w:val="26"/>
         </w:rPr>
-        <w:t>Treating it as a muscle</w:t>
+        <w:t>Challenging your own beliefs is the part that develops it</w:t>
       </w:r>
     </w:p>
     <w:p>
       <w:r>
-        <w:t>Edinburgh are explicit that a single reflection is worth little. The value comes from repeating the process across a series of experiences until it becomes a habit and a mindset (University of Edinburgh, no date c). The models are circular by design: what you learn from one experience feeds into the next.</w:t>
+        <w:t>Self-assessment tells you where you are. What moves you is testing beliefs you did not know you were holding, and there are techniques for it.</w:t>
       </w:r>
     </w:p>
     <w:p>
       <w:r>
-        <w:t>That is a training principle, and it means reflective capability is built the way any capability is built, by repetition at a level slightly beyond what the person can already do, with feedback. It also means it decays. A practitioner who reflected well as a student and has since written nothing but assessments is not still carrying the capability because they once demonstrated it.</w:t>
+        <w:t>Start with the gap between what you say you believe and what your practice shows you believe. Argyris and Schön (1974) called these espoused theory and theory-in-use, and the distance between them is the most productive material a practitioner has. Read your own recording from a case that went badly, ignore your stated reasons, and work out what someone would conclude you believed from your actions alone. About the family. About risk. About what your job is for.</w:t>
       </w:r>
     </w:p>
     <w:p>
       <w:r>
-        <w:t>Two cautions come from my own research with practice educators. Reflection grows under discomfort and stops under anxiety. Participants located learning in being uncomfortable, and also described students who became anxious enough that they preferred silence to being wrong. Load builds the capability, and too much load stops it.</w:t>
+        <w:t>Then ask whether you are fixing the action or the assumption underneath it. Single-loop learning corrects the step that went wrong. Double-loop learning questions the governing value that made the step seem right (Argyris and Schön, 1978). 'I should have phoned before visiting' is single-loop. 'Why do I assume I need this family to like me at a first visit' is double-loop, and it is the one that changes anything.</w:t>
       </w:r>
     </w:p>
     <w:p>
       <w:r>
-        <w:t>The second caution is about power. One participant observed that power decreases feelings of uncomfortableness. The person setting the load feels less of it than the person carrying it, and the supervisor who decides whether a session was productively challenging is the one who felt least of it.</w:t>
+        <w:t>Then get outside your own account, because you cannot challenge your assumptions using only the lens that produced them, which is exactly what a solo reflective log asks you to do. Brookfield (1995) sets out four lenses: your own experience, the eyes of the people you work with, your colleagues' perceptions, and the literature. Three of those require you to go and ask somebody.</w:t>
       </w:r>
     </w:p>
     <w:p>
       <w:r>
-        <w:t>Edinburgh reach the same problem from the other direction. When we ask someone to produce a reflection, we create an audience for it, and that has consequences for how authentic mandatory and assessed reflection can be. They are direct that we cannot know whether a reflector is being authentic, and that a person can still reflect honestly within a framework without disclosing more than they want to (University of Edinburgh, no date d).</w:t>
+        <w:t>Then commit in advance. Before the next visit, write down what you think is happening and what you would have to see to abandon that view. A hypothesis is a belief you have agreed in advance to give up, and Mason (1993) described the working position as safe uncertainty, holding a view firmly enough to act on while staying genuinely open to being wrong. Recording the falsifying condition before the evidence arrives is the only reliable protection against deciding afterwards that you knew all along.</w:t>
       </w:r>
     </w:p>
     <w:p>
       <w:r>
-        <w:t>For social work this is the whole difficulty in one sentence. Asking a worker to reflect out loud is asking them to receive help from somebody who may be writing their assessment. Practice educators in my study said they recognised self-awareness most reliably by its absence, because absence is easier to evidence than presence. A profession that mainly detects the failure to reflect teaches its members that reflecting out loud is dangerous, and then wonders why the logs read like forms.</w:t>
+        <w:t>None of this is comfortable, and the discomfort is the mechanism rather than a side effect.</w:t>
+      </w:r>
+    </w:p>
+    <w:p>
+      <w:pPr>
+        <w:pStyle w:val="Heading2"/>
+        <w:spacing w:before="320"/>
+      </w:pPr>
+      <w:r>
+        <w:rPr>
+          <w:rFonts w:ascii="Calibri" w:hAnsi="Calibri"/>
+          <w:sz w:val="26"/>
+        </w:rPr>
+        <w:t>The load, and who is carrying it</w:t>
+      </w:r>
+    </w:p>
+    <w:p>
+      <w:r>
+        <w:t>Edinburgh are explicit that a single reflection is worth little, and that the value comes from repeating the process across a series of experiences until it becomes a habit (University of Edinburgh, no date c). That also means the capability decays. Someone who reflected well as a student and has since written nothing but assessments is not still carrying it.</w:t>
+      </w:r>
+    </w:p>
+    <w:p>
+      <w:r>
+        <w:t>Two cautions come from my own research with practice educators. Reflection grows under discomfort and stops under anxiety: participants located learning in being uncomfortable, and also described students who became anxious enough to prefer silence to being wrong. And one participant observed that power decreases feelings of uncomfortableness. The person setting the load feels less of it than the person carrying it.</w:t>
+      </w:r>
+    </w:p>
+    <w:p>
+      <w:r>
+        <w:t>Edinburgh reach the same problem from the other side. Asking someone to produce a reflection creates an audience for it, which has consequences for how authentic assessed reflection can be, and they are direct that we cannot know whether a reflector is being honest (University of Edinburgh, no date d). Asking a worker to reflect out loud is asking them to receive help from somebody who may be writing their assessment. That is the argument for self-assessment tools rather than more of them: a rubric you run on yourself has no audience.</w:t>
       </w:r>
     </w:p>
     <w:p>
@@ -248,7 +231,7 @@
         <w:pStyle w:val="ListBullet"/>
       </w:pPr>
       <w:r>
-        <w:t>Diagnose before you prescribe. Locate the next reflective account you read on the 5R stages, then name the single next move rather than asking for more depth in general.</w:t>
+        <w:t>Grade your own reflection before anyone else does. Locate your last written reflection on the 5R stages and on Edinburgh's rubric, and write down the single next move.</w:t>
       </w:r>
     </w:p>
     <w:p>
@@ -256,7 +239,7 @@
         <w:pStyle w:val="ListBullet"/>
       </w:pPr>
       <w:r>
-        <w:t>Set the assumption-testing task explicitly. What does this rest on, what would change your mind, and what else could these facts mean. Ask it about your own judgements first.</w:t>
+        <w:t>Read your own recording for what it shows you believed, not for what you said you believed.</w:t>
       </w:r>
     </w:p>
     <w:p>
@@ -264,7 +247,7 @@
         <w:pStyle w:val="ListBullet"/>
       </w:pPr>
       <w:r>
-        <w:t>Separate the training conversation from the assessment. Say out loud which one this is, because the person opposite you cannot always tell.</w:t>
+        <w:t>Take one current case and write the falsifying condition down now, before the next visit.</w:t>
       </w:r>
     </w:p>
     <w:p>
@@ -272,7 +255,7 @@
         <w:pStyle w:val="ListBullet"/>
       </w:pPr>
       <w:r>
-        <w:t>Use a published rubric rather than your own instinct, and give it to the person before they write, not after.</w:t>
+        <w:t>Borrow a lens. Ask a colleague what they think you are missing on the case you are most confident about.</w:t>
       </w:r>
     </w:p>
     <w:p>
@@ -280,7 +263,7 @@
         <w:pStyle w:val="ListBullet"/>
       </w:pPr>
       <w:r>
-        <w:t>Reflect on a series, not an incident. Ask what the last four visits have in common, which is a question a single-event cycle cannot reach.</w:t>
+        <w:t>Reflect on a series, not an incident. Ask what your last four visits have in common, which no single-event cycle can reach.</w:t>
       </w:r>
     </w:p>
     <w:p>
@@ -299,6 +282,34 @@
           <w:sz w:val="26"/>
         </w:rPr>
         <w:t>References</w:t>
+      </w:r>
+    </w:p>
+    <w:p>
+      <w:r>
+        <w:t xml:space="preserve">Argyris, C. and Schön, D.A. (1974) </w:t>
+      </w:r>
+      <w:r>
+        <w:rPr>
+          <w:i/>
+        </w:rPr>
+        <w:t>Theory in Practice: Increasing Professional Effectiveness</w:t>
+      </w:r>
+      <w:r>
+        <w:t>. San Francisco: Jossey-Bass.</w:t>
+      </w:r>
+    </w:p>
+    <w:p>
+      <w:r>
+        <w:t xml:space="preserve">Argyris, C. and Schön, D.A. (1978) </w:t>
+      </w:r>
+      <w:r>
+        <w:rPr>
+          <w:i/>
+        </w:rPr>
+        <w:t>Organizational Learning: A Theory of Action Perspective</w:t>
+      </w:r>
+      <w:r>
+        <w:t>. Reading, MA: Addison-Wesley.</w:t>
       </w:r>
     </w:p>
     <w:p>
@@ -345,6 +356,20 @@
     </w:p>
     <w:p>
       <w:r>
+        <w:t xml:space="preserve">Brookfield, S.D. (1995) </w:t>
+      </w:r>
+      <w:r>
+        <w:rPr>
+          <w:i/>
+        </w:rPr>
+        <w:t>Becoming a Critically Reflective Teacher</w:t>
+      </w:r>
+      <w:r>
+        <w:t>. San Francisco: Jossey-Bass.</w:t>
+      </w:r>
+    </w:p>
+    <w:p>
+      <w:r>
         <w:t xml:space="preserve">Mason, B. (1993) 'Towards positions of safe uncertainty', </w:t>
       </w:r>
       <w:r>
@@ -373,6 +398,20 @@
     </w:p>
     <w:p>
       <w:r>
+        <w:t xml:space="preserve">Moon, J.A. (2006) </w:t>
+      </w:r>
+      <w:r>
+        <w:rPr>
+          <w:i/>
+        </w:rPr>
+        <w:t>Learning Journals: A Handbook for Reflective Practice and Professional Development</w:t>
+      </w:r>
+      <w:r>
+        <w:t>. 2nd edn. London: Routledge.</w:t>
+      </w:r>
+    </w:p>
+    <w:p>
+      <w:r>
         <w:t xml:space="preserve">University of Edinburgh (no date a) </w:t>
       </w:r>
       <w:r>
@@ -393,10 +432,10 @@
         <w:rPr>
           <w:i/>
         </w:rPr>
-        <w:t>Reflection literature</w:t>
+        <w:t>Assessment rubrics</w:t>
       </w:r>
       <w:r>
-        <w:t>. Available at: https://reflection.ed.ac.uk/literature (Accessed: [DATE]).</w:t>
+        <w:t>. Available at: https://reflection.ed.ac.uk/facilitators-toolkit/assessment/rubrics (Accessed: [DATE]).</w:t>
       </w:r>
     </w:p>
     <w:p>

</xml_diff>